<commit_message>
Separar entregable al cliente e informe interno de hallazgos
- Portal en dos ediciones: cliente (descriptiva, sin indicadores con meta,
  identidad ni diagnóstico de FK) e interna (con vistas Calidad e Identidad)
- Resumen ejecutivo reescrito como documento descriptivo de entrega
- Nuevo generar_informe_interno.py: indicadores con estado, hallazgos con
  evidencia, oportunidades de mejora priorizadas y anexos; salida en interno/
- CSV de diagnóstico a interno/csv; interno/ fuera de Git
- docx_util.py con utilidades comunes; CLAUDE.md y README actualizados

Co-Authored-By: Claude Opus 5.5 <noreply@anthropic.com>
Claude-Session: https://claude.ai/code/session_013GnFNUEqthoQuKaWiAcs4T
</commit_message>
<xml_diff>
--- a/pruebas/muestra/Resumen_Ejecutivo_BD_ESAP_v0.1-prueba.docx
+++ b/pruebas/muestra/Resumen_Ejecutivo_BD_ESAP_v0.1-prueba.docx
@@ -16,7 +16,7 @@
         <w:rPr>
           <w:b/>
           <w:color w:val="0B3D91"/>
-          <w:sz w:val="44"/>
+          <w:sz w:val="42"/>
         </w:rPr>
         <w:t>Resumen ejecutivo de la base de datos</w:t>
       </w:r>
@@ -31,7 +31,7 @@
     </w:p>
     <w:p>
       <w:r>
-        <w:t xml:space="preserve">Detalle navegable en el Portal de Datos ESAP: </w:t>
+        <w:t xml:space="preserve">Portal de Datos ESAP: </w:t>
       </w:r>
       <w:hyperlink r:id="rId9">
         <w:r>
@@ -53,7 +53,7 @@
     </w:p>
     <w:p>
       <w:r>
-        <w:t>Este documento resume el estado de la base de datos de la SuperApp ESAP como parte de su entrega: qué contiene, cómo está organizada, cómo se relacionan sus datos y qué tan documentada y consistente es su estructura. Está pensado para una lectura rápida. El detalle de cada tabla, columna y relación está en el Portal de Datos ESAP, y las consultas, los archivos CSV y la documentación en Markdown que lo respaldan están en el repositorio técnico (sección 7).</w:t>
+        <w:t>Este documento presenta la base de datos de la SuperApp ESAP: su alcance, su organización por dominios y el contenido de su modelo. El detalle de cada tabla, columna y relación se consulta en el Portal de Datos ESAP. Las consultas, los archivos CSV y la documentación en Markdown que respaldan el portal están en el repositorio técnico (sección 6).</w:t>
       </w:r>
     </w:p>
     <w:p>
@@ -66,7 +66,7 @@
     </w:p>
     <w:p>
       <w:r>
-        <w:t>Las cifras provienen de una extracción de solo lectura de la base esap_qa_prueba2 del entorno QA (prueba), hecha el 21 de octubre de 2026. La extracción consulta el catálogo de PostgreSQL, las estadísticas del planificador y conteos agregados; no extrae ni publica valores de datos personales.</w:t>
+        <w:t>La información proviene de una extracción de solo lectura de la base esap_qa_prueba2 en el entorno QA (prueba), realizada el 21 de octubre de 2026. La extracción consulta el catálogo de PostgreSQL, las estadísticas del motor y conteos agregados. No incluye valores de los registros.</w:t>
       </w:r>
     </w:p>
     <w:tbl>
@@ -84,7 +84,7 @@
       <w:tr>
         <w:tc>
           <w:tcPr>
-            <w:tcW w:type="dxa" w:w="3402"/>
+            <w:tcW w:type="dxa" w:w="3118"/>
             <w:shd w:val="clear" w:color="auto" w:fill="0B3D91"/>
           </w:tcPr>
           <w:p>
@@ -101,7 +101,7 @@
         </w:tc>
         <w:tc>
           <w:tcPr>
-            <w:tcW w:type="dxa" w:w="5669"/>
+            <w:tcW w:type="dxa" w:w="5953"/>
             <w:shd w:val="clear" w:color="auto" w:fill="0B3D91"/>
           </w:tcPr>
           <w:p>
@@ -120,7 +120,7 @@
       <w:tr>
         <w:tc>
           <w:tcPr>
-            <w:tcW w:type="dxa" w:w="3402"/>
+            <w:tcW w:type="dxa" w:w="3118"/>
           </w:tcPr>
           <w:p>
             <w:r/>
@@ -134,7 +134,7 @@
         </w:tc>
         <w:tc>
           <w:tcPr>
-            <w:tcW w:type="dxa" w:w="5669"/>
+            <w:tcW w:type="dxa" w:w="5953"/>
           </w:tcPr>
           <w:p>
             <w:r/>
@@ -150,7 +150,7 @@
       <w:tr>
         <w:tc>
           <w:tcPr>
-            <w:tcW w:type="dxa" w:w="3402"/>
+            <w:tcW w:type="dxa" w:w="3118"/>
           </w:tcPr>
           <w:p>
             <w:r/>
@@ -164,7 +164,7 @@
         </w:tc>
         <w:tc>
           <w:tcPr>
-            <w:tcW w:type="dxa" w:w="5669"/>
+            <w:tcW w:type="dxa" w:w="5953"/>
           </w:tcPr>
           <w:p>
             <w:r/>
@@ -180,7 +180,7 @@
       <w:tr>
         <w:tc>
           <w:tcPr>
-            <w:tcW w:type="dxa" w:w="3402"/>
+            <w:tcW w:type="dxa" w:w="3118"/>
           </w:tcPr>
           <w:p>
             <w:r/>
@@ -194,7 +194,7 @@
         </w:tc>
         <w:tc>
           <w:tcPr>
-            <w:tcW w:type="dxa" w:w="5669"/>
+            <w:tcW w:type="dxa" w:w="5953"/>
           </w:tcPr>
           <w:p>
             <w:r/>
@@ -210,7 +210,7 @@
       <w:tr>
         <w:tc>
           <w:tcPr>
-            <w:tcW w:type="dxa" w:w="3402"/>
+            <w:tcW w:type="dxa" w:w="3118"/>
           </w:tcPr>
           <w:p>
             <w:r/>
@@ -224,7 +224,7 @@
         </w:tc>
         <w:tc>
           <w:tcPr>
-            <w:tcW w:type="dxa" w:w="5669"/>
+            <w:tcW w:type="dxa" w:w="5953"/>
           </w:tcPr>
           <w:p>
             <w:r/>
@@ -232,7 +232,7 @@
               <w:rPr>
                 <w:sz w:val="18"/>
               </w:rPr>
-              <w:t>18 (1 de apoyo: respaldos, copias o migraciones)</w:t>
+              <w:t>18, de las cuales 1 son de apoyo (respaldos, copias o migraciones)</w:t>
             </w:r>
           </w:p>
         </w:tc>
@@ -240,7 +240,7 @@
       <w:tr>
         <w:tc>
           <w:tcPr>
-            <w:tcW w:type="dxa" w:w="3402"/>
+            <w:tcW w:type="dxa" w:w="3118"/>
           </w:tcPr>
           <w:p>
             <w:r/>
@@ -254,7 +254,7 @@
         </w:tc>
         <w:tc>
           <w:tcPr>
-            <w:tcW w:type="dxa" w:w="5669"/>
+            <w:tcW w:type="dxa" w:w="5953"/>
           </w:tcPr>
           <w:p>
             <w:r/>
@@ -270,7 +270,7 @@
       <w:tr>
         <w:tc>
           <w:tcPr>
-            <w:tcW w:type="dxa" w:w="3402"/>
+            <w:tcW w:type="dxa" w:w="3118"/>
           </w:tcPr>
           <w:p>
             <w:r/>
@@ -284,7 +284,7 @@
         </w:tc>
         <w:tc>
           <w:tcPr>
-            <w:tcW w:type="dxa" w:w="5669"/>
+            <w:tcW w:type="dxa" w:w="5953"/>
           </w:tcPr>
           <w:p>
             <w:r/>
@@ -300,67 +300,7 @@
       <w:tr>
         <w:tc>
           <w:tcPr>
-            <w:tcW w:type="dxa" w:w="3402"/>
-          </w:tcPr>
-          <w:p>
-            <w:r/>
-            <w:r>
-              <w:rPr>
-                <w:sz w:val="18"/>
-              </w:rPr>
-              <w:t>Relaciones declaradas (FK)</w:t>
-            </w:r>
-          </w:p>
-        </w:tc>
-        <w:tc>
-          <w:tcPr>
-            <w:tcW w:type="dxa" w:w="5669"/>
-          </w:tcPr>
-          <w:p>
-            <w:r/>
-            <w:r>
-              <w:rPr>
-                <w:sz w:val="18"/>
-              </w:rPr>
-              <w:t>7</w:t>
-            </w:r>
-          </w:p>
-        </w:tc>
-      </w:tr>
-      <w:tr>
-        <w:tc>
-          <w:tcPr>
-            <w:tcW w:type="dxa" w:w="3402"/>
-          </w:tcPr>
-          <w:p>
-            <w:r/>
-            <w:r>
-              <w:rPr>
-                <w:sz w:val="18"/>
-              </w:rPr>
-              <w:t>Funciones y procedimientos · triggers</w:t>
-            </w:r>
-          </w:p>
-        </w:tc>
-        <w:tc>
-          <w:tcPr>
-            <w:tcW w:type="dxa" w:w="5669"/>
-          </w:tcPr>
-          <w:p>
-            <w:r/>
-            <w:r>
-              <w:rPr>
-                <w:sz w:val="18"/>
-              </w:rPr>
-              <w:t>3 · 1</w:t>
-            </w:r>
-          </w:p>
-        </w:tc>
-      </w:tr>
-      <w:tr>
-        <w:tc>
-          <w:tcPr>
-            <w:tcW w:type="dxa" w:w="3402"/>
+            <w:tcW w:type="dxa" w:w="3118"/>
           </w:tcPr>
           <w:p>
             <w:r/>
@@ -374,7 +314,7 @@
         </w:tc>
         <w:tc>
           <w:tcPr>
-            <w:tcW w:type="dxa" w:w="5669"/>
+            <w:tcW w:type="dxa" w:w="5953"/>
           </w:tcPr>
           <w:p>
             <w:r/>
@@ -399,7 +339,7 @@
     </w:p>
     <w:p>
       <w:r>
-        <w:t>Cada esquema de la base corresponde a un dominio funcional de la SuperApp:</w:t>
+        <w:t>Cada esquema de la base agrupa las tablas de un dominio funcional de la SuperApp.</w:t>
       </w:r>
     </w:p>
     <w:tbl>
@@ -411,17 +351,16 @@
         <w:tblLook w:firstColumn="1" w:firstRow="1" w:lastColumn="0" w:lastRow="0" w:noHBand="0" w:noVBand="1" w:val="04A0"/>
       </w:tblPr>
       <w:tblGrid>
-        <w:gridCol w:w="1605"/>
-        <w:gridCol w:w="1605"/>
-        <w:gridCol w:w="1605"/>
-        <w:gridCol w:w="1605"/>
-        <w:gridCol w:w="1605"/>
-        <w:gridCol w:w="1605"/>
+        <w:gridCol w:w="1926"/>
+        <w:gridCol w:w="1926"/>
+        <w:gridCol w:w="1926"/>
+        <w:gridCol w:w="1926"/>
+        <w:gridCol w:w="1926"/>
       </w:tblGrid>
       <w:tr>
         <w:tc>
           <w:tcPr>
-            <w:tcW w:type="dxa" w:w="2835"/>
+            <w:tcW w:type="dxa" w:w="3061"/>
             <w:shd w:val="clear" w:color="auto" w:fill="0B3D91"/>
           </w:tcPr>
           <w:p>
@@ -438,7 +377,7 @@
         </w:tc>
         <w:tc>
           <w:tcPr>
-            <w:tcW w:type="dxa" w:w="2381"/>
+            <w:tcW w:type="dxa" w:w="2608"/>
             <w:shd w:val="clear" w:color="auto" w:fill="0B3D91"/>
           </w:tcPr>
           <w:p>
@@ -455,7 +394,7 @@
         </w:tc>
         <w:tc>
           <w:tcPr>
-            <w:tcW w:type="dxa" w:w="907"/>
+            <w:tcW w:type="dxa" w:w="1020"/>
             <w:shd w:val="clear" w:color="auto" w:fill="0B3D91"/>
           </w:tcPr>
           <w:p>
@@ -472,7 +411,7 @@
         </w:tc>
         <w:tc>
           <w:tcPr>
-            <w:tcW w:type="dxa" w:w="1020"/>
+            <w:tcW w:type="dxa" w:w="1134"/>
             <w:shd w:val="clear" w:color="auto" w:fill="0B3D91"/>
           </w:tcPr>
           <w:p>
@@ -489,7 +428,7 @@
         </w:tc>
         <w:tc>
           <w:tcPr>
-            <w:tcW w:type="dxa" w:w="1247"/>
+            <w:tcW w:type="dxa" w:w="1474"/>
             <w:shd w:val="clear" w:color="auto" w:fill="0B3D91"/>
           </w:tcPr>
           <w:p>
@@ -504,28 +443,11 @@
             </w:r>
           </w:p>
         </w:tc>
-        <w:tc>
-          <w:tcPr>
-            <w:tcW w:type="dxa" w:w="907"/>
-            <w:shd w:val="clear" w:color="auto" w:fill="0B3D91"/>
-          </w:tcPr>
-          <w:p>
-            <w:r/>
-            <w:r>
-              <w:rPr>
-                <w:b/>
-                <w:color w:val="FFFFFF"/>
-                <w:sz w:val="18"/>
-              </w:rPr>
-              <w:t>Sin filas</w:t>
-            </w:r>
-          </w:p>
-        </w:tc>
       </w:tr>
       <w:tr>
         <w:tc>
           <w:tcPr>
-            <w:tcW w:type="dxa" w:w="2835"/>
+            <w:tcW w:type="dxa" w:w="3061"/>
           </w:tcPr>
           <w:p>
             <w:r/>
@@ -539,7 +461,7 @@
         </w:tc>
         <w:tc>
           <w:tcPr>
-            <w:tcW w:type="dxa" w:w="2381"/>
+            <w:tcW w:type="dxa" w:w="2608"/>
           </w:tcPr>
           <w:p>
             <w:r/>
@@ -548,513 +470,6 @@
                 <w:sz w:val="18"/>
               </w:rPr>
               <w:t>auth</w:t>
-            </w:r>
-          </w:p>
-        </w:tc>
-        <w:tc>
-          <w:tcPr>
-            <w:tcW w:type="dxa" w:w="907"/>
-          </w:tcPr>
-          <w:p>
-            <w:pPr>
-              <w:jc w:val="right"/>
-            </w:pPr>
-            <w:r/>
-            <w:r>
-              <w:rPr>
-                <w:sz w:val="18"/>
-              </w:rPr>
-              <w:t>5</w:t>
-            </w:r>
-          </w:p>
-        </w:tc>
-        <w:tc>
-          <w:tcPr>
-            <w:tcW w:type="dxa" w:w="1020"/>
-          </w:tcPr>
-          <w:p>
-            <w:pPr>
-              <w:jc w:val="right"/>
-            </w:pPr>
-            <w:r/>
-            <w:r>
-              <w:rPr>
-                <w:sz w:val="18"/>
-              </w:rPr>
-              <w:t>25</w:t>
-            </w:r>
-          </w:p>
-        </w:tc>
-        <w:tc>
-          <w:tcPr>
-            <w:tcW w:type="dxa" w:w="1247"/>
-          </w:tcPr>
-          <w:p>
-            <w:pPr>
-              <w:jc w:val="right"/>
-            </w:pPr>
-            <w:r/>
-            <w:r>
-              <w:rPr>
-                <w:sz w:val="18"/>
-              </w:rPr>
-              <w:t>1.355</w:t>
-            </w:r>
-          </w:p>
-        </w:tc>
-        <w:tc>
-          <w:tcPr>
-            <w:tcW w:type="dxa" w:w="907"/>
-          </w:tcPr>
-          <w:p>
-            <w:pPr>
-              <w:jc w:val="right"/>
-            </w:pPr>
-            <w:r/>
-            <w:r>
-              <w:rPr>
-                <w:sz w:val="18"/>
-              </w:rPr>
-              <w:t>0</w:t>
-            </w:r>
-          </w:p>
-        </w:tc>
-      </w:tr>
-      <w:tr>
-        <w:tc>
-          <w:tcPr>
-            <w:tcW w:type="dxa" w:w="2835"/>
-          </w:tcPr>
-          <w:p>
-            <w:r/>
-            <w:r>
-              <w:rPr>
-                <w:sz w:val="18"/>
-              </w:rPr>
-              <w:t>Registro académico</w:t>
-            </w:r>
-          </w:p>
-        </w:tc>
-        <w:tc>
-          <w:tcPr>
-            <w:tcW w:type="dxa" w:w="2381"/>
-          </w:tcPr>
-          <w:p>
-            <w:r/>
-            <w:r>
-              <w:rPr>
-                <w:sz w:val="18"/>
-              </w:rPr>
-              <w:t>academic_registration</w:t>
-            </w:r>
-          </w:p>
-        </w:tc>
-        <w:tc>
-          <w:tcPr>
-            <w:tcW w:type="dxa" w:w="907"/>
-          </w:tcPr>
-          <w:p>
-            <w:pPr>
-              <w:jc w:val="right"/>
-            </w:pPr>
-            <w:r/>
-            <w:r>
-              <w:rPr>
-                <w:sz w:val="18"/>
-              </w:rPr>
-              <w:t>4</w:t>
-            </w:r>
-          </w:p>
-        </w:tc>
-        <w:tc>
-          <w:tcPr>
-            <w:tcW w:type="dxa" w:w="1020"/>
-          </w:tcPr>
-          <w:p>
-            <w:pPr>
-              <w:jc w:val="right"/>
-            </w:pPr>
-            <w:r/>
-            <w:r>
-              <w:rPr>
-                <w:sz w:val="18"/>
-              </w:rPr>
-              <w:t>21</w:t>
-            </w:r>
-          </w:p>
-        </w:tc>
-        <w:tc>
-          <w:tcPr>
-            <w:tcW w:type="dxa" w:w="1247"/>
-          </w:tcPr>
-          <w:p>
-            <w:pPr>
-              <w:jc w:val="right"/>
-            </w:pPr>
-            <w:r/>
-            <w:r>
-              <w:rPr>
-                <w:sz w:val="18"/>
-              </w:rPr>
-              <w:t>1.502</w:t>
-            </w:r>
-          </w:p>
-        </w:tc>
-        <w:tc>
-          <w:tcPr>
-            <w:tcW w:type="dxa" w:w="907"/>
-          </w:tcPr>
-          <w:p>
-            <w:pPr>
-              <w:jc w:val="right"/>
-            </w:pPr>
-            <w:r/>
-            <w:r>
-              <w:rPr>
-                <w:sz w:val="18"/>
-              </w:rPr>
-              <w:t>0</w:t>
-            </w:r>
-          </w:p>
-        </w:tc>
-      </w:tr>
-      <w:tr>
-        <w:tc>
-          <w:tcPr>
-            <w:tcW w:type="dxa" w:w="2835"/>
-          </w:tcPr>
-          <w:p>
-            <w:r/>
-            <w:r>
-              <w:rPr>
-                <w:sz w:val="18"/>
-              </w:rPr>
-              <w:t>Certificaciones</w:t>
-            </w:r>
-          </w:p>
-        </w:tc>
-        <w:tc>
-          <w:tcPr>
-            <w:tcW w:type="dxa" w:w="2381"/>
-          </w:tcPr>
-          <w:p>
-            <w:r/>
-            <w:r>
-              <w:rPr>
-                <w:sz w:val="18"/>
-              </w:rPr>
-              <w:t>certification</w:t>
-            </w:r>
-          </w:p>
-        </w:tc>
-        <w:tc>
-          <w:tcPr>
-            <w:tcW w:type="dxa" w:w="907"/>
-          </w:tcPr>
-          <w:p>
-            <w:pPr>
-              <w:jc w:val="right"/>
-            </w:pPr>
-            <w:r/>
-            <w:r>
-              <w:rPr>
-                <w:sz w:val="18"/>
-              </w:rPr>
-              <w:t>2</w:t>
-            </w:r>
-          </w:p>
-        </w:tc>
-        <w:tc>
-          <w:tcPr>
-            <w:tcW w:type="dxa" w:w="1020"/>
-          </w:tcPr>
-          <w:p>
-            <w:pPr>
-              <w:jc w:val="right"/>
-            </w:pPr>
-            <w:r/>
-            <w:r>
-              <w:rPr>
-                <w:sz w:val="18"/>
-              </w:rPr>
-              <w:t>12</w:t>
-            </w:r>
-          </w:p>
-        </w:tc>
-        <w:tc>
-          <w:tcPr>
-            <w:tcW w:type="dxa" w:w="1247"/>
-          </w:tcPr>
-          <w:p>
-            <w:pPr>
-              <w:jc w:val="right"/>
-            </w:pPr>
-            <w:r/>
-            <w:r>
-              <w:rPr>
-                <w:sz w:val="18"/>
-              </w:rPr>
-              <w:t>700</w:t>
-            </w:r>
-          </w:p>
-        </w:tc>
-        <w:tc>
-          <w:tcPr>
-            <w:tcW w:type="dxa" w:w="907"/>
-          </w:tcPr>
-          <w:p>
-            <w:pPr>
-              <w:jc w:val="right"/>
-            </w:pPr>
-            <w:r/>
-            <w:r>
-              <w:rPr>
-                <w:sz w:val="18"/>
-              </w:rPr>
-              <w:t>1</w:t>
-            </w:r>
-          </w:p>
-        </w:tc>
-      </w:tr>
-      <w:tr>
-        <w:tc>
-          <w:tcPr>
-            <w:tcW w:type="dxa" w:w="2835"/>
-          </w:tcPr>
-          <w:p>
-            <w:r/>
-            <w:r>
-              <w:rPr>
-                <w:sz w:val="18"/>
-              </w:rPr>
-              <w:t>Gestión jurídica</w:t>
-            </w:r>
-          </w:p>
-        </w:tc>
-        <w:tc>
-          <w:tcPr>
-            <w:tcW w:type="dxa" w:w="2381"/>
-          </w:tcPr>
-          <w:p>
-            <w:r/>
-            <w:r>
-              <w:rPr>
-                <w:sz w:val="18"/>
-              </w:rPr>
-              <w:t>legal_management</w:t>
-            </w:r>
-          </w:p>
-        </w:tc>
-        <w:tc>
-          <w:tcPr>
-            <w:tcW w:type="dxa" w:w="907"/>
-          </w:tcPr>
-          <w:p>
-            <w:pPr>
-              <w:jc w:val="right"/>
-            </w:pPr>
-            <w:r/>
-            <w:r>
-              <w:rPr>
-                <w:sz w:val="18"/>
-              </w:rPr>
-              <w:t>2</w:t>
-            </w:r>
-          </w:p>
-        </w:tc>
-        <w:tc>
-          <w:tcPr>
-            <w:tcW w:type="dxa" w:w="1020"/>
-          </w:tcPr>
-          <w:p>
-            <w:pPr>
-              <w:jc w:val="right"/>
-            </w:pPr>
-            <w:r/>
-            <w:r>
-              <w:rPr>
-                <w:sz w:val="18"/>
-              </w:rPr>
-              <w:t>9</w:t>
-            </w:r>
-          </w:p>
-        </w:tc>
-        <w:tc>
-          <w:tcPr>
-            <w:tcW w:type="dxa" w:w="1247"/>
-          </w:tcPr>
-          <w:p>
-            <w:pPr>
-              <w:jc w:val="right"/>
-            </w:pPr>
-            <w:r/>
-            <w:r>
-              <w:rPr>
-                <w:sz w:val="18"/>
-              </w:rPr>
-              <w:t>80</w:t>
-            </w:r>
-          </w:p>
-        </w:tc>
-        <w:tc>
-          <w:tcPr>
-            <w:tcW w:type="dxa" w:w="907"/>
-          </w:tcPr>
-          <w:p>
-            <w:pPr>
-              <w:jc w:val="right"/>
-            </w:pPr>
-            <w:r/>
-            <w:r>
-              <w:rPr>
-                <w:sz w:val="18"/>
-              </w:rPr>
-              <w:t>0</w:t>
-            </w:r>
-          </w:p>
-        </w:tc>
-      </w:tr>
-      <w:tr>
-        <w:tc>
-          <w:tcPr>
-            <w:tcW w:type="dxa" w:w="2835"/>
-          </w:tcPr>
-          <w:p>
-            <w:r/>
-            <w:r>
-              <w:rPr>
-                <w:sz w:val="18"/>
-              </w:rPr>
-              <w:t>Control interno</w:t>
-            </w:r>
-          </w:p>
-        </w:tc>
-        <w:tc>
-          <w:tcPr>
-            <w:tcW w:type="dxa" w:w="2381"/>
-          </w:tcPr>
-          <w:p>
-            <w:r/>
-            <w:r>
-              <w:rPr>
-                <w:sz w:val="18"/>
-              </w:rPr>
-              <w:t>control_interno</w:t>
-            </w:r>
-          </w:p>
-        </w:tc>
-        <w:tc>
-          <w:tcPr>
-            <w:tcW w:type="dxa" w:w="907"/>
-          </w:tcPr>
-          <w:p>
-            <w:pPr>
-              <w:jc w:val="right"/>
-            </w:pPr>
-            <w:r/>
-            <w:r>
-              <w:rPr>
-                <w:sz w:val="18"/>
-              </w:rPr>
-              <w:t>3</w:t>
-            </w:r>
-          </w:p>
-        </w:tc>
-        <w:tc>
-          <w:tcPr>
-            <w:tcW w:type="dxa" w:w="1020"/>
-          </w:tcPr>
-          <w:p>
-            <w:pPr>
-              <w:jc w:val="right"/>
-            </w:pPr>
-            <w:r/>
-            <w:r>
-              <w:rPr>
-                <w:sz w:val="18"/>
-              </w:rPr>
-              <w:t>10</w:t>
-            </w:r>
-          </w:p>
-        </w:tc>
-        <w:tc>
-          <w:tcPr>
-            <w:tcW w:type="dxa" w:w="1247"/>
-          </w:tcPr>
-          <w:p>
-            <w:pPr>
-              <w:jc w:val="right"/>
-            </w:pPr>
-            <w:r/>
-            <w:r>
-              <w:rPr>
-                <w:sz w:val="18"/>
-              </w:rPr>
-              <w:t>0</w:t>
-            </w:r>
-          </w:p>
-        </w:tc>
-        <w:tc>
-          <w:tcPr>
-            <w:tcW w:type="dxa" w:w="907"/>
-          </w:tcPr>
-          <w:p>
-            <w:pPr>
-              <w:jc w:val="right"/>
-            </w:pPr>
-            <w:r/>
-            <w:r>
-              <w:rPr>
-                <w:sz w:val="18"/>
-              </w:rPr>
-              <w:t>3</w:t>
-            </w:r>
-          </w:p>
-        </w:tc>
-      </w:tr>
-      <w:tr>
-        <w:tc>
-          <w:tcPr>
-            <w:tcW w:type="dxa" w:w="2835"/>
-          </w:tcPr>
-          <w:p>
-            <w:r/>
-            <w:r>
-              <w:rPr>
-                <w:sz w:val="18"/>
-              </w:rPr>
-              <w:t>Notificaciones</w:t>
-            </w:r>
-          </w:p>
-        </w:tc>
-        <w:tc>
-          <w:tcPr>
-            <w:tcW w:type="dxa" w:w="2381"/>
-          </w:tcPr>
-          <w:p>
-            <w:r/>
-            <w:r>
-              <w:rPr>
-                <w:sz w:val="18"/>
-              </w:rPr>
-              <w:t>notifications</w:t>
-            </w:r>
-          </w:p>
-        </w:tc>
-        <w:tc>
-          <w:tcPr>
-            <w:tcW w:type="dxa" w:w="907"/>
-          </w:tcPr>
-          <w:p>
-            <w:pPr>
-              <w:jc w:val="right"/>
-            </w:pPr>
-            <w:r/>
-            <w:r>
-              <w:rPr>
-                <w:sz w:val="18"/>
-              </w:rPr>
-              <w:t>1</w:t>
             </w:r>
           </w:p>
         </w:tc>
@@ -1077,7 +492,7 @@
         </w:tc>
         <w:tc>
           <w:tcPr>
-            <w:tcW w:type="dxa" w:w="1247"/>
+            <w:tcW w:type="dxa" w:w="1134"/>
           </w:tcPr>
           <w:p>
             <w:pPr>
@@ -1088,13 +503,13 @@
               <w:rPr>
                 <w:sz w:val="18"/>
               </w:rPr>
-              <w:t>300</w:t>
+              <w:t>25</w:t>
             </w:r>
           </w:p>
         </w:tc>
         <w:tc>
           <w:tcPr>
-            <w:tcW w:type="dxa" w:w="907"/>
+            <w:tcW w:type="dxa" w:w="1474"/>
           </w:tcPr>
           <w:p>
             <w:pPr>
@@ -1105,7 +520,7 @@
               <w:rPr>
                 <w:sz w:val="18"/>
               </w:rPr>
-              <w:t>0</w:t>
+              <w:t>1.355</w:t>
             </w:r>
           </w:p>
         </w:tc>
@@ -1113,7 +528,7 @@
       <w:tr>
         <w:tc>
           <w:tcPr>
-            <w:tcW w:type="dxa" w:w="2835"/>
+            <w:tcW w:type="dxa" w:w="3061"/>
           </w:tcPr>
           <w:p>
             <w:r/>
@@ -1121,13 +536,13 @@
               <w:rPr>
                 <w:sz w:val="18"/>
               </w:rPr>
-              <w:t>Auditoría y trazabilidad</w:t>
+              <w:t>Registro académico</w:t>
             </w:r>
           </w:p>
         </w:tc>
         <w:tc>
           <w:tcPr>
-            <w:tcW w:type="dxa" w:w="2381"/>
+            <w:tcW w:type="dxa" w:w="2608"/>
           </w:tcPr>
           <w:p>
             <w:r/>
@@ -1135,24 +550,7 @@
               <w:rPr>
                 <w:sz w:val="18"/>
               </w:rPr>
-              <w:t>audit</w:t>
-            </w:r>
-          </w:p>
-        </w:tc>
-        <w:tc>
-          <w:tcPr>
-            <w:tcW w:type="dxa" w:w="907"/>
-          </w:tcPr>
-          <w:p>
-            <w:pPr>
-              <w:jc w:val="right"/>
-            </w:pPr>
-            <w:r/>
-            <w:r>
-              <w:rPr>
-                <w:sz w:val="18"/>
-              </w:rPr>
-              <w:t>1</w:t>
+              <w:t>academic_registration</w:t>
             </w:r>
           </w:p>
         </w:tc>
@@ -1169,202 +567,7 @@
               <w:rPr>
                 <w:sz w:val="18"/>
               </w:rPr>
-              <w:t>7</w:t>
-            </w:r>
-          </w:p>
-        </w:tc>
-        <w:tc>
-          <w:tcPr>
-            <w:tcW w:type="dxa" w:w="1247"/>
-          </w:tcPr>
-          <w:p>
-            <w:pPr>
-              <w:jc w:val="right"/>
-            </w:pPr>
-            <w:r/>
-            <w:r>
-              <w:rPr>
-                <w:sz w:val="18"/>
-              </w:rPr>
-              <w:t>500</w:t>
-            </w:r>
-          </w:p>
-        </w:tc>
-        <w:tc>
-          <w:tcPr>
-            <w:tcW w:type="dxa" w:w="907"/>
-          </w:tcPr>
-          <w:p>
-            <w:pPr>
-              <w:jc w:val="right"/>
-            </w:pPr>
-            <w:r/>
-            <w:r>
-              <w:rPr>
-                <w:sz w:val="18"/>
-              </w:rPr>
-              <w:t>0</w:t>
-            </w:r>
-          </w:p>
-        </w:tc>
-      </w:tr>
-    </w:tbl>
-    <w:p/>
-    <w:p>
-      <w:pPr>
-        <w:pStyle w:val="Heading1"/>
-      </w:pPr>
-      <w:r>
-        <w:t>4. Indicadores de calidad del modelo</w:t>
-      </w:r>
-    </w:p>
-    <w:p>
-      <w:r>
-        <w:t>Los indicadores se calculan sobre las tablas operativas (sin las de apoyo) y se agrupan por dimensión de calidad de datos según ISO/IEC 25012. La meta indica el valor de referencia para una base lista para producción.</w:t>
-      </w:r>
-    </w:p>
-    <w:tbl>
-      <w:tblPr>
-        <w:tblStyle w:val="TableGrid"/>
-        <w:tblW w:type="auto" w:w="0"/>
-        <w:jc w:val="center"/>
-        <w:tblLayout w:type="fixed"/>
-        <w:tblLook w:firstColumn="1" w:firstRow="1" w:lastColumn="0" w:lastRow="0" w:noHBand="0" w:noVBand="1" w:val="04A0"/>
-      </w:tblPr>
-      <w:tblGrid>
-        <w:gridCol w:w="1926"/>
-        <w:gridCol w:w="1926"/>
-        <w:gridCol w:w="1926"/>
-        <w:gridCol w:w="1926"/>
-        <w:gridCol w:w="1926"/>
-      </w:tblGrid>
-      <w:tr>
-        <w:tc>
-          <w:tcPr>
-            <w:tcW w:type="dxa" w:w="680"/>
-            <w:shd w:val="clear" w:color="auto" w:fill="0B3D91"/>
-          </w:tcPr>
-          <w:p>
-            <w:r/>
-            <w:r>
-              <w:rPr>
-                <w:b/>
-                <w:color w:val="FFFFFF"/>
-                <w:sz w:val="18"/>
-              </w:rPr>
-              <w:t>Id</w:t>
-            </w:r>
-          </w:p>
-        </w:tc>
-        <w:tc>
-          <w:tcPr>
-            <w:tcW w:type="dxa" w:w="3685"/>
-            <w:shd w:val="clear" w:color="auto" w:fill="0B3D91"/>
-          </w:tcPr>
-          <w:p>
-            <w:r/>
-            <w:r>
-              <w:rPr>
-                <w:b/>
-                <w:color w:val="FFFFFF"/>
-                <w:sz w:val="18"/>
-              </w:rPr>
-              <w:t>Indicador</w:t>
-            </w:r>
-          </w:p>
-        </w:tc>
-        <w:tc>
-          <w:tcPr>
-            <w:tcW w:type="dxa" w:w="2041"/>
-            <w:shd w:val="clear" w:color="auto" w:fill="0B3D91"/>
-          </w:tcPr>
-          <w:p>
-            <w:r/>
-            <w:r>
-              <w:rPr>
-                <w:b/>
-                <w:color w:val="FFFFFF"/>
-                <w:sz w:val="18"/>
-              </w:rPr>
-              <w:t>Dimensión</w:t>
-            </w:r>
-          </w:p>
-        </w:tc>
-        <w:tc>
-          <w:tcPr>
-            <w:tcW w:type="dxa" w:w="1134"/>
-            <w:shd w:val="clear" w:color="auto" w:fill="0B3D91"/>
-          </w:tcPr>
-          <w:p>
-            <w:r/>
-            <w:r>
-              <w:rPr>
-                <w:b/>
-                <w:color w:val="FFFFFF"/>
-                <w:sz w:val="18"/>
-              </w:rPr>
-              <w:t>Valor</w:t>
-            </w:r>
-          </w:p>
-        </w:tc>
-        <w:tc>
-          <w:tcPr>
-            <w:tcW w:type="dxa" w:w="1247"/>
-            <w:shd w:val="clear" w:color="auto" w:fill="0B3D91"/>
-          </w:tcPr>
-          <w:p>
-            <w:r/>
-            <w:r>
-              <w:rPr>
-                <w:b/>
-                <w:color w:val="FFFFFF"/>
-                <w:sz w:val="18"/>
-              </w:rPr>
-              <w:t>Meta</w:t>
-            </w:r>
-          </w:p>
-        </w:tc>
-      </w:tr>
-      <w:tr>
-        <w:tc>
-          <w:tcPr>
-            <w:tcW w:type="dxa" w:w="680"/>
-          </w:tcPr>
-          <w:p>
-            <w:r/>
-            <w:r>
-              <w:rPr>
-                <w:sz w:val="18"/>
-              </w:rPr>
-              <w:t>K01</w:t>
-            </w:r>
-          </w:p>
-        </w:tc>
-        <w:tc>
-          <w:tcPr>
-            <w:tcW w:type="dxa" w:w="3685"/>
-          </w:tcPr>
-          <w:p>
-            <w:r/>
-            <w:r>
-              <w:rPr>
-                <w:sz w:val="18"/>
-              </w:rPr>
-              <w:t>Tablas con descripción</w:t>
-            </w:r>
-          </w:p>
-        </w:tc>
-        <w:tc>
-          <w:tcPr>
-            <w:tcW w:type="dxa" w:w="2041"/>
-          </w:tcPr>
-          <w:p>
-            <w:r/>
-            <w:r>
-              <w:rPr>
-                <w:sz w:val="18"/>
-              </w:rPr>
-              <w:t>Comprensibilidad</w:t>
+              <w:t>4</w:t>
             </w:r>
           </w:p>
         </w:tc>
@@ -1381,13 +584,32 @@
               <w:rPr>
                 <w:sz w:val="18"/>
               </w:rPr>
-              <w:t>5,9 %</w:t>
+              <w:t>21</w:t>
             </w:r>
           </w:p>
         </w:tc>
         <w:tc>
           <w:tcPr>
-            <w:tcW w:type="dxa" w:w="1247"/>
+            <w:tcW w:type="dxa" w:w="1474"/>
+          </w:tcPr>
+          <w:p>
+            <w:pPr>
+              <w:jc w:val="right"/>
+            </w:pPr>
+            <w:r/>
+            <w:r>
+              <w:rPr>
+                <w:sz w:val="18"/>
+              </w:rPr>
+              <w:t>1.502</w:t>
+            </w:r>
+          </w:p>
+        </w:tc>
+      </w:tr>
+      <w:tr>
+        <w:tc>
+          <w:tcPr>
+            <w:tcW w:type="dxa" w:w="3061"/>
           </w:tcPr>
           <w:p>
             <w:r/>
@@ -1395,15 +617,13 @@
               <w:rPr>
                 <w:sz w:val="18"/>
               </w:rPr>
-              <w:t>≥ 95 %</w:t>
+              <w:t>Certificaciones</w:t>
             </w:r>
           </w:p>
         </w:tc>
-      </w:tr>
-      <w:tr>
         <w:tc>
           <w:tcPr>
-            <w:tcW w:type="dxa" w:w="680"/>
+            <w:tcW w:type="dxa" w:w="2608"/>
           </w:tcPr>
           <w:p>
             <w:r/>
@@ -1411,35 +631,24 @@
               <w:rPr>
                 <w:sz w:val="18"/>
               </w:rPr>
-              <w:t>K02</w:t>
+              <w:t>certification</w:t>
             </w:r>
           </w:p>
         </w:tc>
         <w:tc>
           <w:tcPr>
-            <w:tcW w:type="dxa" w:w="3685"/>
+            <w:tcW w:type="dxa" w:w="1020"/>
           </w:tcPr>
           <w:p>
+            <w:pPr>
+              <w:jc w:val="right"/>
+            </w:pPr>
             <w:r/>
             <w:r>
               <w:rPr>
                 <w:sz w:val="18"/>
               </w:rPr>
-              <w:t>Columnas con descripción</w:t>
-            </w:r>
-          </w:p>
-        </w:tc>
-        <w:tc>
-          <w:tcPr>
-            <w:tcW w:type="dxa" w:w="2041"/>
-          </w:tcPr>
-          <w:p>
-            <w:r/>
-            <w:r>
-              <w:rPr>
-                <w:sz w:val="18"/>
-              </w:rPr>
-              <w:t>Comprensibilidad</w:t>
+              <w:t>2</w:t>
             </w:r>
           </w:p>
         </w:tc>
@@ -1456,71 +665,13 @@
               <w:rPr>
                 <w:sz w:val="18"/>
               </w:rPr>
-              <w:t>1,2 %</w:t>
+              <w:t>12</w:t>
             </w:r>
           </w:p>
         </w:tc>
         <w:tc>
           <w:tcPr>
-            <w:tcW w:type="dxa" w:w="1247"/>
-          </w:tcPr>
-          <w:p>
-            <w:r/>
-            <w:r>
-              <w:rPr>
-                <w:sz w:val="18"/>
-              </w:rPr>
-              <w:t>≥ 95 %</w:t>
-            </w:r>
-          </w:p>
-        </w:tc>
-      </w:tr>
-      <w:tr>
-        <w:tc>
-          <w:tcPr>
-            <w:tcW w:type="dxa" w:w="680"/>
-          </w:tcPr>
-          <w:p>
-            <w:r/>
-            <w:r>
-              <w:rPr>
-                <w:sz w:val="18"/>
-              </w:rPr>
-              <w:t>K03</w:t>
-            </w:r>
-          </w:p>
-        </w:tc>
-        <w:tc>
-          <w:tcPr>
-            <w:tcW w:type="dxa" w:w="3685"/>
-          </w:tcPr>
-          <w:p>
-            <w:r/>
-            <w:r>
-              <w:rPr>
-                <w:sz w:val="18"/>
-              </w:rPr>
-              <w:t>Tablas con clave primaria</w:t>
-            </w:r>
-          </w:p>
-        </w:tc>
-        <w:tc>
-          <w:tcPr>
-            <w:tcW w:type="dxa" w:w="2041"/>
-          </w:tcPr>
-          <w:p>
-            <w:r/>
-            <w:r>
-              <w:rPr>
-                <w:sz w:val="18"/>
-              </w:rPr>
-              <w:t>Unicidad</w:t>
-            </w:r>
-          </w:p>
-        </w:tc>
-        <w:tc>
-          <w:tcPr>
-            <w:tcW w:type="dxa" w:w="1134"/>
+            <w:tcW w:type="dxa" w:w="1474"/>
           </w:tcPr>
           <w:p>
             <w:pPr>
@@ -1531,13 +682,15 @@
               <w:rPr>
                 <w:sz w:val="18"/>
               </w:rPr>
-              <w:t>88,2 %</w:t>
+              <w:t>700</w:t>
             </w:r>
           </w:p>
         </w:tc>
+      </w:tr>
+      <w:tr>
         <w:tc>
           <w:tcPr>
-            <w:tcW w:type="dxa" w:w="1247"/>
+            <w:tcW w:type="dxa" w:w="3061"/>
           </w:tcPr>
           <w:p>
             <w:r/>
@@ -1545,15 +698,13 @@
               <w:rPr>
                 <w:sz w:val="18"/>
               </w:rPr>
-              <w:t>100 %</w:t>
+              <w:t>Gestión jurídica</w:t>
             </w:r>
           </w:p>
         </w:tc>
-      </w:tr>
-      <w:tr>
         <w:tc>
           <w:tcPr>
-            <w:tcW w:type="dxa" w:w="680"/>
+            <w:tcW w:type="dxa" w:w="2608"/>
           </w:tcPr>
           <w:p>
             <w:r/>
@@ -1561,41 +712,13 @@
               <w:rPr>
                 <w:sz w:val="18"/>
               </w:rPr>
-              <w:t>K04</w:t>
+              <w:t>legal_management</w:t>
             </w:r>
           </w:p>
         </w:tc>
         <w:tc>
           <w:tcPr>
-            <w:tcW w:type="dxa" w:w="3685"/>
-          </w:tcPr>
-          <w:p>
-            <w:r/>
-            <w:r>
-              <w:rPr>
-                <w:sz w:val="18"/>
-              </w:rPr>
-              <w:t>Relaciones declaradas como FK</w:t>
-            </w:r>
-          </w:p>
-        </w:tc>
-        <w:tc>
-          <w:tcPr>
-            <w:tcW w:type="dxa" w:w="2041"/>
-          </w:tcPr>
-          <w:p>
-            <w:r/>
-            <w:r>
-              <w:rPr>
-                <w:sz w:val="18"/>
-              </w:rPr>
-              <w:t>Integridad referencial</w:t>
-            </w:r>
-          </w:p>
-        </w:tc>
-        <w:tc>
-          <w:tcPr>
-            <w:tcW w:type="dxa" w:w="1134"/>
+            <w:tcW w:type="dxa" w:w="1020"/>
           </w:tcPr>
           <w:p>
             <w:pPr>
@@ -1606,365 +729,7 @@
               <w:rPr>
                 <w:sz w:val="18"/>
               </w:rPr>
-              <w:t>70,0 %</w:t>
-            </w:r>
-          </w:p>
-        </w:tc>
-        <w:tc>
-          <w:tcPr>
-            <w:tcW w:type="dxa" w:w="1247"/>
-          </w:tcPr>
-          <w:p>
-            <w:r/>
-            <w:r>
-              <w:rPr>
-                <w:sz w:val="18"/>
-              </w:rPr>
-              <w:t>≥ 95 %</w:t>
-            </w:r>
-          </w:p>
-        </w:tc>
-      </w:tr>
-      <w:tr>
-        <w:tc>
-          <w:tcPr>
-            <w:tcW w:type="dxa" w:w="680"/>
-          </w:tcPr>
-          <w:p>
-            <w:r/>
-            <w:r>
-              <w:rPr>
-                <w:sz w:val="18"/>
-              </w:rPr>
-              <w:t>K05</w:t>
-            </w:r>
-          </w:p>
-        </w:tc>
-        <w:tc>
-          <w:tcPr>
-            <w:tcW w:type="dxa" w:w="3685"/>
-          </w:tcPr>
-          <w:p>
-            <w:r/>
-            <w:r>
-              <w:rPr>
-                <w:sz w:val="18"/>
-              </w:rPr>
-              <w:t>FK con índice en la columna hija</w:t>
-            </w:r>
-          </w:p>
-        </w:tc>
-        <w:tc>
-          <w:tcPr>
-            <w:tcW w:type="dxa" w:w="2041"/>
-          </w:tcPr>
-          <w:p>
-            <w:r/>
-            <w:r>
-              <w:rPr>
-                <w:sz w:val="18"/>
-              </w:rPr>
-              <w:t>Eficiencia</w:t>
-            </w:r>
-          </w:p>
-        </w:tc>
-        <w:tc>
-          <w:tcPr>
-            <w:tcW w:type="dxa" w:w="1134"/>
-          </w:tcPr>
-          <w:p>
-            <w:pPr>
-              <w:jc w:val="right"/>
-            </w:pPr>
-            <w:r/>
-            <w:r>
-              <w:rPr>
-                <w:sz w:val="18"/>
-              </w:rPr>
-              <w:t>14,3 %</w:t>
-            </w:r>
-          </w:p>
-        </w:tc>
-        <w:tc>
-          <w:tcPr>
-            <w:tcW w:type="dxa" w:w="1247"/>
-          </w:tcPr>
-          <w:p>
-            <w:r/>
-            <w:r>
-              <w:rPr>
-                <w:sz w:val="18"/>
-              </w:rPr>
-              <w:t>100 %</w:t>
-            </w:r>
-          </w:p>
-        </w:tc>
-      </w:tr>
-      <w:tr>
-        <w:tc>
-          <w:tcPr>
-            <w:tcW w:type="dxa" w:w="680"/>
-          </w:tcPr>
-          <w:p>
-            <w:r/>
-            <w:r>
-              <w:rPr>
-                <w:sz w:val="18"/>
-              </w:rPr>
-              <w:t>K06</w:t>
-            </w:r>
-          </w:p>
-        </w:tc>
-        <w:tc>
-          <w:tcPr>
-            <w:tcW w:type="dxa" w:w="3685"/>
-          </w:tcPr>
-          <w:p>
-            <w:r/>
-            <w:r>
-              <w:rPr>
-                <w:sz w:val="18"/>
-              </w:rPr>
-              <w:t>Valores sin registro padre en FK</w:t>
-            </w:r>
-          </w:p>
-        </w:tc>
-        <w:tc>
-          <w:tcPr>
-            <w:tcW w:type="dxa" w:w="2041"/>
-          </w:tcPr>
-          <w:p>
-            <w:r/>
-            <w:r>
-              <w:rPr>
-                <w:sz w:val="18"/>
-              </w:rPr>
-              <w:t>Consistencia</w:t>
-            </w:r>
-          </w:p>
-        </w:tc>
-        <w:tc>
-          <w:tcPr>
-            <w:tcW w:type="dxa" w:w="1134"/>
-          </w:tcPr>
-          <w:p>
-            <w:pPr>
-              <w:jc w:val="right"/>
-            </w:pPr>
-            <w:r/>
-            <w:r>
-              <w:rPr>
-                <w:sz w:val="18"/>
-              </w:rPr>
-              <w:t>0</w:t>
-            </w:r>
-          </w:p>
-        </w:tc>
-        <w:tc>
-          <w:tcPr>
-            <w:tcW w:type="dxa" w:w="1247"/>
-          </w:tcPr>
-          <w:p>
-            <w:r/>
-            <w:r>
-              <w:rPr>
-                <w:sz w:val="18"/>
-              </w:rPr>
-              <w:t>0</w:t>
-            </w:r>
-          </w:p>
-        </w:tc>
-      </w:tr>
-      <w:tr>
-        <w:tc>
-          <w:tcPr>
-            <w:tcW w:type="dxa" w:w="680"/>
-          </w:tcPr>
-          <w:p>
-            <w:r/>
-            <w:r>
-              <w:rPr>
-                <w:sz w:val="18"/>
-              </w:rPr>
-              <w:t>K07</w:t>
-            </w:r>
-          </w:p>
-        </w:tc>
-        <w:tc>
-          <w:tcPr>
-            <w:tcW w:type="dxa" w:w="3685"/>
-          </w:tcPr>
-          <w:p>
-            <w:r/>
-            <w:r>
-              <w:rPr>
-                <w:sz w:val="18"/>
-              </w:rPr>
-              <w:t>Tablas operativas con datos</w:t>
-            </w:r>
-          </w:p>
-        </w:tc>
-        <w:tc>
-          <w:tcPr>
-            <w:tcW w:type="dxa" w:w="2041"/>
-          </w:tcPr>
-          <w:p>
-            <w:r/>
-            <w:r>
-              <w:rPr>
-                <w:sz w:val="18"/>
-              </w:rPr>
-              <w:t>Actualidad</w:t>
-            </w:r>
-          </w:p>
-        </w:tc>
-        <w:tc>
-          <w:tcPr>
-            <w:tcW w:type="dxa" w:w="1134"/>
-          </w:tcPr>
-          <w:p>
-            <w:pPr>
-              <w:jc w:val="right"/>
-            </w:pPr>
-            <w:r/>
-            <w:r>
-              <w:rPr>
-                <w:sz w:val="18"/>
-              </w:rPr>
-              <w:t>82,4</w:t>
-            </w:r>
-          </w:p>
-        </w:tc>
-        <w:tc>
-          <w:tcPr>
-            <w:tcW w:type="dxa" w:w="1247"/>
-          </w:tcPr>
-          <w:p>
-            <w:r/>
-            <w:r>
-              <w:rPr>
-                <w:sz w:val="18"/>
-              </w:rPr>
-              <w:t>referencia</w:t>
-            </w:r>
-          </w:p>
-        </w:tc>
-      </w:tr>
-      <w:tr>
-        <w:tc>
-          <w:tcPr>
-            <w:tcW w:type="dxa" w:w="680"/>
-          </w:tcPr>
-          <w:p>
-            <w:r/>
-            <w:r>
-              <w:rPr>
-                <w:sz w:val="18"/>
-              </w:rPr>
-              <w:t>K08</w:t>
-            </w:r>
-          </w:p>
-        </w:tc>
-        <w:tc>
-          <w:tcPr>
-            <w:tcW w:type="dxa" w:w="3685"/>
-          </w:tcPr>
-          <w:p>
-            <w:r/>
-            <w:r>
-              <w:rPr>
-                <w:sz w:val="18"/>
-              </w:rPr>
-              <w:t>Tablas de apoyo</w:t>
-            </w:r>
-          </w:p>
-        </w:tc>
-        <w:tc>
-          <w:tcPr>
-            <w:tcW w:type="dxa" w:w="2041"/>
-          </w:tcPr>
-          <w:p>
-            <w:r/>
-            <w:r>
-              <w:rPr>
-                <w:sz w:val="18"/>
-              </w:rPr>
-              <w:t>Mantenibilidad</w:t>
-            </w:r>
-          </w:p>
-        </w:tc>
-        <w:tc>
-          <w:tcPr>
-            <w:tcW w:type="dxa" w:w="1134"/>
-          </w:tcPr>
-          <w:p>
-            <w:pPr>
-              <w:jc w:val="right"/>
-            </w:pPr>
-            <w:r/>
-            <w:r>
-              <w:rPr>
-                <w:sz w:val="18"/>
-              </w:rPr>
-              <w:t>1</w:t>
-            </w:r>
-          </w:p>
-        </w:tc>
-        <w:tc>
-          <w:tcPr>
-            <w:tcW w:type="dxa" w:w="1247"/>
-          </w:tcPr>
-          <w:p>
-            <w:r/>
-            <w:r>
-              <w:rPr>
-                <w:sz w:val="18"/>
-              </w:rPr>
-              <w:t>referencia</w:t>
-            </w:r>
-          </w:p>
-        </w:tc>
-      </w:tr>
-      <w:tr>
-        <w:tc>
-          <w:tcPr>
-            <w:tcW w:type="dxa" w:w="680"/>
-          </w:tcPr>
-          <w:p>
-            <w:r/>
-            <w:r>
-              <w:rPr>
-                <w:sz w:val="18"/>
-              </w:rPr>
-              <w:t>K09</w:t>
-            </w:r>
-          </w:p>
-        </w:tc>
-        <w:tc>
-          <w:tcPr>
-            <w:tcW w:type="dxa" w:w="3685"/>
-          </w:tcPr>
-          <w:p>
-            <w:r/>
-            <w:r>
-              <w:rPr>
-                <w:sz w:val="18"/>
-              </w:rPr>
-              <w:t>Copias de datos de identidad fuera de la fuente maestra</w:t>
-            </w:r>
-          </w:p>
-        </w:tc>
-        <w:tc>
-          <w:tcPr>
-            <w:tcW w:type="dxa" w:w="2041"/>
-          </w:tcPr>
-          <w:p>
-            <w:r/>
-            <w:r>
-              <w:rPr>
-                <w:sz w:val="18"/>
-              </w:rPr>
-              <w:t>Consistencia</w:t>
+              <w:t>2</w:t>
             </w:r>
           </w:p>
         </w:tc>
@@ -1987,7 +752,26 @@
         </w:tc>
         <w:tc>
           <w:tcPr>
-            <w:tcW w:type="dxa" w:w="1247"/>
+            <w:tcW w:type="dxa" w:w="1474"/>
+          </w:tcPr>
+          <w:p>
+            <w:pPr>
+              <w:jc w:val="right"/>
+            </w:pPr>
+            <w:r/>
+            <w:r>
+              <w:rPr>
+                <w:sz w:val="18"/>
+              </w:rPr>
+              <w:t>80</w:t>
+            </w:r>
+          </w:p>
+        </w:tc>
+      </w:tr>
+      <w:tr>
+        <w:tc>
+          <w:tcPr>
+            <w:tcW w:type="dxa" w:w="3061"/>
           </w:tcPr>
           <w:p>
             <w:r/>
@@ -1995,15 +779,13 @@
               <w:rPr>
                 <w:sz w:val="18"/>
               </w:rPr>
-              <w:t>referencia</w:t>
+              <w:t>Control interno</w:t>
             </w:r>
           </w:p>
         </w:tc>
-      </w:tr>
-      <w:tr>
         <w:tc>
           <w:tcPr>
-            <w:tcW w:type="dxa" w:w="680"/>
+            <w:tcW w:type="dxa" w:w="2608"/>
           </w:tcPr>
           <w:p>
             <w:r/>
@@ -2011,35 +793,24 @@
               <w:rPr>
                 <w:sz w:val="18"/>
               </w:rPr>
-              <w:t>K10</w:t>
+              <w:t>control_interno</w:t>
             </w:r>
           </w:p>
         </w:tc>
         <w:tc>
           <w:tcPr>
-            <w:tcW w:type="dxa" w:w="3685"/>
+            <w:tcW w:type="dxa" w:w="1020"/>
           </w:tcPr>
           <w:p>
+            <w:pPr>
+              <w:jc w:val="right"/>
+            </w:pPr>
             <w:r/>
             <w:r>
               <w:rPr>
                 <w:sz w:val="18"/>
               </w:rPr>
-              <w:t>Columnas con datos personales identificadas</w:t>
-            </w:r>
-          </w:p>
-        </w:tc>
-        <w:tc>
-          <w:tcPr>
-            <w:tcW w:type="dxa" w:w="2041"/>
-          </w:tcPr>
-          <w:p>
-            <w:r/>
-            <w:r>
-              <w:rPr>
-                <w:sz w:val="18"/>
-              </w:rPr>
-              <w:t>Confidencialidad</w:t>
+              <w:t>3</w:t>
             </w:r>
           </w:p>
         </w:tc>
@@ -2056,13 +827,32 @@
               <w:rPr>
                 <w:sz w:val="18"/>
               </w:rPr>
-              <w:t>20</w:t>
+              <w:t>10</w:t>
             </w:r>
           </w:p>
         </w:tc>
         <w:tc>
           <w:tcPr>
-            <w:tcW w:type="dxa" w:w="1247"/>
+            <w:tcW w:type="dxa" w:w="1474"/>
+          </w:tcPr>
+          <w:p>
+            <w:pPr>
+              <w:jc w:val="right"/>
+            </w:pPr>
+            <w:r/>
+            <w:r>
+              <w:rPr>
+                <w:sz w:val="18"/>
+              </w:rPr>
+              <w:t>0</w:t>
+            </w:r>
+          </w:p>
+        </w:tc>
+      </w:tr>
+      <w:tr>
+        <w:tc>
+          <w:tcPr>
+            <w:tcW w:type="dxa" w:w="3061"/>
           </w:tcPr>
           <w:p>
             <w:r/>
@@ -2070,7 +860,153 @@
               <w:rPr>
                 <w:sz w:val="18"/>
               </w:rPr>
-              <w:t>referencia</w:t>
+              <w:t>Notificaciones</w:t>
+            </w:r>
+          </w:p>
+        </w:tc>
+        <w:tc>
+          <w:tcPr>
+            <w:tcW w:type="dxa" w:w="2608"/>
+          </w:tcPr>
+          <w:p>
+            <w:r/>
+            <w:r>
+              <w:rPr>
+                <w:sz w:val="18"/>
+              </w:rPr>
+              <w:t>notifications</w:t>
+            </w:r>
+          </w:p>
+        </w:tc>
+        <w:tc>
+          <w:tcPr>
+            <w:tcW w:type="dxa" w:w="1020"/>
+          </w:tcPr>
+          <w:p>
+            <w:pPr>
+              <w:jc w:val="right"/>
+            </w:pPr>
+            <w:r/>
+            <w:r>
+              <w:rPr>
+                <w:sz w:val="18"/>
+              </w:rPr>
+              <w:t>1</w:t>
+            </w:r>
+          </w:p>
+        </w:tc>
+        <w:tc>
+          <w:tcPr>
+            <w:tcW w:type="dxa" w:w="1134"/>
+          </w:tcPr>
+          <w:p>
+            <w:pPr>
+              <w:jc w:val="right"/>
+            </w:pPr>
+            <w:r/>
+            <w:r>
+              <w:rPr>
+                <w:sz w:val="18"/>
+              </w:rPr>
+              <w:t>5</w:t>
+            </w:r>
+          </w:p>
+        </w:tc>
+        <w:tc>
+          <w:tcPr>
+            <w:tcW w:type="dxa" w:w="1474"/>
+          </w:tcPr>
+          <w:p>
+            <w:pPr>
+              <w:jc w:val="right"/>
+            </w:pPr>
+            <w:r/>
+            <w:r>
+              <w:rPr>
+                <w:sz w:val="18"/>
+              </w:rPr>
+              <w:t>300</w:t>
+            </w:r>
+          </w:p>
+        </w:tc>
+      </w:tr>
+      <w:tr>
+        <w:tc>
+          <w:tcPr>
+            <w:tcW w:type="dxa" w:w="3061"/>
+          </w:tcPr>
+          <w:p>
+            <w:r/>
+            <w:r>
+              <w:rPr>
+                <w:sz w:val="18"/>
+              </w:rPr>
+              <w:t>Auditoría y trazabilidad</w:t>
+            </w:r>
+          </w:p>
+        </w:tc>
+        <w:tc>
+          <w:tcPr>
+            <w:tcW w:type="dxa" w:w="2608"/>
+          </w:tcPr>
+          <w:p>
+            <w:r/>
+            <w:r>
+              <w:rPr>
+                <w:sz w:val="18"/>
+              </w:rPr>
+              <w:t>audit</w:t>
+            </w:r>
+          </w:p>
+        </w:tc>
+        <w:tc>
+          <w:tcPr>
+            <w:tcW w:type="dxa" w:w="1020"/>
+          </w:tcPr>
+          <w:p>
+            <w:pPr>
+              <w:jc w:val="right"/>
+            </w:pPr>
+            <w:r/>
+            <w:r>
+              <w:rPr>
+                <w:sz w:val="18"/>
+              </w:rPr>
+              <w:t>1</w:t>
+            </w:r>
+          </w:p>
+        </w:tc>
+        <w:tc>
+          <w:tcPr>
+            <w:tcW w:type="dxa" w:w="1134"/>
+          </w:tcPr>
+          <w:p>
+            <w:pPr>
+              <w:jc w:val="right"/>
+            </w:pPr>
+            <w:r/>
+            <w:r>
+              <w:rPr>
+                <w:sz w:val="18"/>
+              </w:rPr>
+              <w:t>7</w:t>
+            </w:r>
+          </w:p>
+        </w:tc>
+        <w:tc>
+          <w:tcPr>
+            <w:tcW w:type="dxa" w:w="1474"/>
+          </w:tcPr>
+          <w:p>
+            <w:pPr>
+              <w:jc w:val="right"/>
+            </w:pPr>
+            <w:r/>
+            <w:r>
+              <w:rPr>
+                <w:sz w:val="18"/>
+              </w:rPr>
+              <w:t>500</w:t>
             </w:r>
           </w:p>
         </w:tc>
@@ -2082,105 +1018,456 @@
         <w:pStyle w:val="Heading1"/>
       </w:pPr>
       <w:r>
-        <w:t>5. Hallazgos principales</w:t>
+        <w:t>4. Contenido del modelo</w:t>
       </w:r>
     </w:p>
+    <w:tbl>
+      <w:tblPr>
+        <w:tblStyle w:val="TableGrid"/>
+        <w:tblW w:type="auto" w:w="0"/>
+        <w:jc w:val="center"/>
+        <w:tblLayout w:type="fixed"/>
+        <w:tblLook w:firstColumn="1" w:firstRow="1" w:lastColumn="0" w:lastRow="0" w:noHBand="0" w:noVBand="1" w:val="04A0"/>
+      </w:tblPr>
+      <w:tblGrid>
+        <w:gridCol w:w="3211"/>
+        <w:gridCol w:w="3211"/>
+        <w:gridCol w:w="3211"/>
+      </w:tblGrid>
+      <w:tr>
+        <w:tc>
+          <w:tcPr>
+            <w:tcW w:type="dxa" w:w="4252"/>
+            <w:shd w:val="clear" w:color="auto" w:fill="0B3D91"/>
+          </w:tcPr>
+          <w:p>
+            <w:r/>
+            <w:r>
+              <w:rPr>
+                <w:b/>
+                <w:color w:val="FFFFFF"/>
+                <w:sz w:val="18"/>
+              </w:rPr>
+              <w:t>Componente</w:t>
+            </w:r>
+          </w:p>
+        </w:tc>
+        <w:tc>
+          <w:tcPr>
+            <w:tcW w:type="dxa" w:w="1587"/>
+            <w:shd w:val="clear" w:color="auto" w:fill="0B3D91"/>
+          </w:tcPr>
+          <w:p>
+            <w:r/>
+            <w:r>
+              <w:rPr>
+                <w:b/>
+                <w:color w:val="FFFFFF"/>
+                <w:sz w:val="18"/>
+              </w:rPr>
+              <w:t>Cantidad</w:t>
+            </w:r>
+          </w:p>
+        </w:tc>
+        <w:tc>
+          <w:tcPr>
+            <w:tcW w:type="dxa" w:w="3231"/>
+            <w:shd w:val="clear" w:color="auto" w:fill="0B3D91"/>
+          </w:tcPr>
+          <w:p>
+            <w:r/>
+            <w:r>
+              <w:rPr>
+                <w:b/>
+                <w:color w:val="FFFFFF"/>
+                <w:sz w:val="18"/>
+              </w:rPr>
+              <w:t>Dónde se consulta</w:t>
+            </w:r>
+          </w:p>
+        </w:tc>
+      </w:tr>
+      <w:tr>
+        <w:tc>
+          <w:tcPr>
+            <w:tcW w:type="dxa" w:w="4252"/>
+          </w:tcPr>
+          <w:p>
+            <w:r/>
+            <w:r>
+              <w:rPr>
+                <w:sz w:val="18"/>
+              </w:rPr>
+              <w:t>Relaciones declaradas (llaves foráneas)</w:t>
+            </w:r>
+          </w:p>
+        </w:tc>
+        <w:tc>
+          <w:tcPr>
+            <w:tcW w:type="dxa" w:w="1587"/>
+          </w:tcPr>
+          <w:p>
+            <w:pPr>
+              <w:jc w:val="right"/>
+            </w:pPr>
+            <w:r/>
+            <w:r>
+              <w:rPr>
+                <w:sz w:val="18"/>
+              </w:rPr>
+              <w:t>7</w:t>
+            </w:r>
+          </w:p>
+        </w:tc>
+        <w:tc>
+          <w:tcPr>
+            <w:tcW w:type="dxa" w:w="3231"/>
+          </w:tcPr>
+          <w:p>
+            <w:r/>
+            <w:r>
+              <w:rPr>
+                <w:sz w:val="18"/>
+              </w:rPr>
+              <w:t>Portal › Relaciones y Modelo ER</w:t>
+            </w:r>
+          </w:p>
+        </w:tc>
+      </w:tr>
+      <w:tr>
+        <w:tc>
+          <w:tcPr>
+            <w:tcW w:type="dxa" w:w="4252"/>
+          </w:tcPr>
+          <w:p>
+            <w:r/>
+            <w:r>
+              <w:rPr>
+                <w:sz w:val="18"/>
+              </w:rPr>
+              <w:t>Relaciones lógicas identificadas por nombre de columna</w:t>
+            </w:r>
+          </w:p>
+        </w:tc>
+        <w:tc>
+          <w:tcPr>
+            <w:tcW w:type="dxa" w:w="1587"/>
+          </w:tcPr>
+          <w:p>
+            <w:pPr>
+              <w:jc w:val="right"/>
+            </w:pPr>
+            <w:r/>
+            <w:r>
+              <w:rPr>
+                <w:sz w:val="18"/>
+              </w:rPr>
+              <w:t>3</w:t>
+            </w:r>
+          </w:p>
+        </w:tc>
+        <w:tc>
+          <w:tcPr>
+            <w:tcW w:type="dxa" w:w="3231"/>
+          </w:tcPr>
+          <w:p>
+            <w:r/>
+            <w:r>
+              <w:rPr>
+                <w:sz w:val="18"/>
+              </w:rPr>
+              <w:t>Portal › Relaciones</w:t>
+            </w:r>
+          </w:p>
+        </w:tc>
+      </w:tr>
+      <w:tr>
+        <w:tc>
+          <w:tcPr>
+            <w:tcW w:type="dxa" w:w="4252"/>
+          </w:tcPr>
+          <w:p>
+            <w:r/>
+            <w:r>
+              <w:rPr>
+                <w:sz w:val="18"/>
+              </w:rPr>
+              <w:t>Funciones y procedimientos</w:t>
+            </w:r>
+          </w:p>
+        </w:tc>
+        <w:tc>
+          <w:tcPr>
+            <w:tcW w:type="dxa" w:w="1587"/>
+          </w:tcPr>
+          <w:p>
+            <w:pPr>
+              <w:jc w:val="right"/>
+            </w:pPr>
+            <w:r/>
+            <w:r>
+              <w:rPr>
+                <w:sz w:val="18"/>
+              </w:rPr>
+              <w:t>3</w:t>
+            </w:r>
+          </w:p>
+        </w:tc>
+        <w:tc>
+          <w:tcPr>
+            <w:tcW w:type="dxa" w:w="3231"/>
+          </w:tcPr>
+          <w:p>
+            <w:r/>
+            <w:r>
+              <w:rPr>
+                <w:sz w:val="18"/>
+              </w:rPr>
+              <w:t>Portal › Programables</w:t>
+            </w:r>
+          </w:p>
+        </w:tc>
+      </w:tr>
+      <w:tr>
+        <w:tc>
+          <w:tcPr>
+            <w:tcW w:type="dxa" w:w="4252"/>
+          </w:tcPr>
+          <w:p>
+            <w:r/>
+            <w:r>
+              <w:rPr>
+                <w:sz w:val="18"/>
+              </w:rPr>
+              <w:t>Triggers</w:t>
+            </w:r>
+          </w:p>
+        </w:tc>
+        <w:tc>
+          <w:tcPr>
+            <w:tcW w:type="dxa" w:w="1587"/>
+          </w:tcPr>
+          <w:p>
+            <w:pPr>
+              <w:jc w:val="right"/>
+            </w:pPr>
+            <w:r/>
+            <w:r>
+              <w:rPr>
+                <w:sz w:val="18"/>
+              </w:rPr>
+              <w:t>1</w:t>
+            </w:r>
+          </w:p>
+        </w:tc>
+        <w:tc>
+          <w:tcPr>
+            <w:tcW w:type="dxa" w:w="3231"/>
+          </w:tcPr>
+          <w:p>
+            <w:r/>
+            <w:r>
+              <w:rPr>
+                <w:sz w:val="18"/>
+              </w:rPr>
+              <w:t>Portal › Programables</w:t>
+            </w:r>
+          </w:p>
+        </w:tc>
+      </w:tr>
+      <w:tr>
+        <w:tc>
+          <w:tcPr>
+            <w:tcW w:type="dxa" w:w="4252"/>
+          </w:tcPr>
+          <w:p>
+            <w:r/>
+            <w:r>
+              <w:rPr>
+                <w:sz w:val="18"/>
+              </w:rPr>
+              <w:t>Vistas</w:t>
+            </w:r>
+          </w:p>
+        </w:tc>
+        <w:tc>
+          <w:tcPr>
+            <w:tcW w:type="dxa" w:w="1587"/>
+          </w:tcPr>
+          <w:p>
+            <w:pPr>
+              <w:jc w:val="right"/>
+            </w:pPr>
+            <w:r/>
+            <w:r>
+              <w:rPr>
+                <w:sz w:val="18"/>
+              </w:rPr>
+              <w:t>1</w:t>
+            </w:r>
+          </w:p>
+        </w:tc>
+        <w:tc>
+          <w:tcPr>
+            <w:tcW w:type="dxa" w:w="3231"/>
+          </w:tcPr>
+          <w:p>
+            <w:r/>
+            <w:r>
+              <w:rPr>
+                <w:sz w:val="18"/>
+              </w:rPr>
+              <w:t>Portal › Programables y Catálogo</w:t>
+            </w:r>
+          </w:p>
+        </w:tc>
+      </w:tr>
+      <w:tr>
+        <w:tc>
+          <w:tcPr>
+            <w:tcW w:type="dxa" w:w="4252"/>
+          </w:tcPr>
+          <w:p>
+            <w:r/>
+            <w:r>
+              <w:rPr>
+                <w:sz w:val="18"/>
+              </w:rPr>
+              <w:t>Tipos enumerados</w:t>
+            </w:r>
+          </w:p>
+        </w:tc>
+        <w:tc>
+          <w:tcPr>
+            <w:tcW w:type="dxa" w:w="1587"/>
+          </w:tcPr>
+          <w:p>
+            <w:pPr>
+              <w:jc w:val="right"/>
+            </w:pPr>
+            <w:r/>
+            <w:r>
+              <w:rPr>
+                <w:sz w:val="18"/>
+              </w:rPr>
+              <w:t>0</w:t>
+            </w:r>
+          </w:p>
+        </w:tc>
+        <w:tc>
+          <w:tcPr>
+            <w:tcW w:type="dxa" w:w="3231"/>
+          </w:tcPr>
+          <w:p>
+            <w:r/>
+            <w:r>
+              <w:rPr>
+                <w:sz w:val="18"/>
+              </w:rPr>
+              <w:t>Portal › Programables</w:t>
+            </w:r>
+          </w:p>
+        </w:tc>
+      </w:tr>
+      <w:tr>
+        <w:tc>
+          <w:tcPr>
+            <w:tcW w:type="dxa" w:w="4252"/>
+          </w:tcPr>
+          <w:p>
+            <w:r/>
+            <w:r>
+              <w:rPr>
+                <w:sz w:val="18"/>
+              </w:rPr>
+              <w:t>Tablas con descripción registrada en la base</w:t>
+            </w:r>
+          </w:p>
+        </w:tc>
+        <w:tc>
+          <w:tcPr>
+            <w:tcW w:type="dxa" w:w="1587"/>
+          </w:tcPr>
+          <w:p>
+            <w:pPr>
+              <w:jc w:val="right"/>
+            </w:pPr>
+            <w:r/>
+            <w:r>
+              <w:rPr>
+                <w:sz w:val="18"/>
+              </w:rPr>
+              <w:t>1 de 18</w:t>
+            </w:r>
+          </w:p>
+        </w:tc>
+        <w:tc>
+          <w:tcPr>
+            <w:tcW w:type="dxa" w:w="3231"/>
+          </w:tcPr>
+          <w:p>
+            <w:r/>
+            <w:r>
+              <w:rPr>
+                <w:sz w:val="18"/>
+              </w:rPr>
+              <w:t>Portal › Catálogo</w:t>
+            </w:r>
+          </w:p>
+        </w:tc>
+      </w:tr>
+      <w:tr>
+        <w:tc>
+          <w:tcPr>
+            <w:tcW w:type="dxa" w:w="4252"/>
+          </w:tcPr>
+          <w:p>
+            <w:r/>
+            <w:r>
+              <w:rPr>
+                <w:sz w:val="18"/>
+              </w:rPr>
+              <w:t>Columnas con descripción registrada en la base</w:t>
+            </w:r>
+          </w:p>
+        </w:tc>
+        <w:tc>
+          <w:tcPr>
+            <w:tcW w:type="dxa" w:w="1587"/>
+          </w:tcPr>
+          <w:p>
+            <w:pPr>
+              <w:jc w:val="right"/>
+            </w:pPr>
+            <w:r/>
+            <w:r>
+              <w:rPr>
+                <w:sz w:val="18"/>
+              </w:rPr>
+              <w:t>1 de 89</w:t>
+            </w:r>
+          </w:p>
+        </w:tc>
+        <w:tc>
+          <w:tcPr>
+            <w:tcW w:type="dxa" w:w="3231"/>
+          </w:tcPr>
+          <w:p>
+            <w:r/>
+            <w:r>
+              <w:rPr>
+                <w:sz w:val="18"/>
+              </w:rPr>
+              <w:t>Portal › Catálogo</w:t>
+            </w:r>
+          </w:p>
+        </w:tc>
+      </w:tr>
+    </w:tbl>
+    <w:p/>
     <w:p>
-      <w:pPr>
-        <w:pStyle w:val="ListBullet"/>
-      </w:pPr>
       <w:r>
-        <w:rPr>
-          <w:b/>
-        </w:rPr>
-        <w:t>Identidad replicada.</w:t>
-      </w:r>
-      <w:r>
-        <w:t xml:space="preserve"> Hay 9 columnas de correo o documento en 5 esquemas (academic_registration, auth, certification, legal_management, notifications) que repiten datos de identidad en lugar de referenciar a la persona en la fuente maestra (auth.personas.dir_email, auth.personas.num_identificacion). Ejemplos: certification.certificates.email (250 de 700 valores fuera de la maestra); academic_registration.inscripciones.num_identificacion (150 de 600 valores fuera de la maestra); academic_registration.inscripciones.dir_email (300 de 600 valores fuera de la maestra). Cuando la misma persona se registra en varios módulos, sus datos pueden divergir.</w:t>
-      </w:r>
-    </w:p>
-    <w:p>
-      <w:pPr>
-        <w:pStyle w:val="ListBullet"/>
-      </w:pPr>
-      <w:r>
-        <w:rPr>
-          <w:b/>
-        </w:rPr>
-        <w:t>Relaciones sin restricción.</w:t>
-      </w:r>
-      <w:r>
-        <w:t xml:space="preserve"> Además de las 7 FK declaradas, 3 columnas apuntan por su nombre a la clave de otra tabla sin una FK que lo garantice; los datos confirman total o parcialmente 3 de ellas. Sin la FK, la base no impide registros que apunten a datos inexistentes (indicador K04: 70,0 % de las relaciones están declaradas).</w:t>
-      </w:r>
-    </w:p>
-    <w:p>
-      <w:pPr>
-        <w:pStyle w:val="ListBullet"/>
-      </w:pPr>
-      <w:r>
-        <w:rPr>
-          <w:b/>
-        </w:rPr>
-        <w:t>Documentación del diccionario.</w:t>
-      </w:r>
-      <w:r>
-        <w:t xml:space="preserve"> 5,9 % de las tablas y 1,2 % de las columnas tienen descripción registrada en la base (meta ≥ 95 %). Las demás aparecen en el portal como «por documentar».</w:t>
-      </w:r>
-    </w:p>
-    <w:p>
-      <w:pPr>
-        <w:pStyle w:val="ListBullet"/>
-      </w:pPr>
-      <w:r>
-        <w:rPr>
-          <w:b/>
-        </w:rPr>
-        <w:t>Tablas sin uso aparente.</w:t>
-      </w:r>
-      <w:r>
-        <w:t xml:space="preserve"> 3 tablas operativas no tienen filas en QA (prueba) y 1 tablas son de apoyo (respaldos, copias o migraciones). Pueden corresponder a módulos aún sin uso en este entorno o a estructuras por depurar.</w:t>
-      </w:r>
-    </w:p>
-    <w:p>
-      <w:pPr>
-        <w:pStyle w:val="ListBullet"/>
-      </w:pPr>
-      <w:r>
-        <w:rPr>
-          <w:b/>
-        </w:rPr>
-        <w:t>Tablas sin clave primaria.</w:t>
-      </w:r>
-      <w:r>
-        <w:t xml:space="preserve"> 2 tablas operativas no declaran clave primaria (auth.personas, control_interno.followups).</w:t>
-      </w:r>
-    </w:p>
-    <w:p>
-      <w:pPr>
-        <w:pStyle w:val="ListBullet"/>
-      </w:pPr>
-      <w:r>
-        <w:rPr>
-          <w:b/>
-        </w:rPr>
-        <w:t>Índices de relaciones.</w:t>
-      </w:r>
-      <w:r>
-        <w:t xml:space="preserve"> 6 de 7 FK no tienen índice en la columna hija, lo que puede hacer lentas las consultas que unen esas tablas y los borrados en la tabla padre.</w:t>
-      </w:r>
-    </w:p>
-    <w:p>
-      <w:pPr>
-        <w:pStyle w:val="ListBullet"/>
-      </w:pPr>
-      <w:r>
-        <w:rPr>
-          <w:b/>
-        </w:rPr>
-        <w:t>Datos personales.</w:t>
-      </w:r>
-      <w:r>
-        <w:t xml:space="preserve"> 20 columnas contienen datos personales según su nombre (4 de nivel alto: identificación, credenciales o datos sensibles). Su tratamiento debe responder a la Ley 1581 de 2012.</w:t>
+        <w:t>Las relaciones se documentan con su multiplicidad UML (por ejemplo, 0..* → 1), medida con los datos del entorno. El modelo entidad-relación se presenta por dominio y muestra también las relaciones con tablas de otros dominios.</w:t>
       </w:r>
     </w:p>
     <w:p>
@@ -2188,99 +1475,202 @@
         <w:pStyle w:val="Heading1"/>
       </w:pPr>
       <w:r>
-        <w:t>6. Recomendaciones</w:t>
+        <w:t>5. Datos personales</w:t>
       </w:r>
     </w:p>
     <w:p>
-      <w:pPr>
-        <w:pStyle w:val="ListNumber"/>
-      </w:pPr>
       <w:r>
-        <w:rPr>
-          <w:b/>
-        </w:rPr>
-        <w:t xml:space="preserve">Fuente única de identidad. </w:t>
-      </w:r>
-      <w:r>
-        <w:t>Tomar auth.personas.dir_email, auth.personas.num_identificacion como la fuente de los datos de contacto e identificación, y que los módulos guarden solo la referencia a la persona (su identificador), resolviendo correo y documento en el momento de la consulta.</w:t>
+        <w:t>El portal identifica 22 columnas que, por su nombre, contienen datos personales, clasificadas según las categorías de la Ley 1581 de 2012. La clasificación se hace por nombre de columna, sin revisar valores, y sirve de insumo para el responsable del tratamiento de datos.</w:t>
       </w:r>
     </w:p>
-    <w:p>
-      <w:pPr>
-        <w:pStyle w:val="ListNumber"/>
-      </w:pPr>
-      <w:r>
-        <w:rPr>
-          <w:b/>
-        </w:rPr>
-        <w:t xml:space="preserve">Declarar las relaciones confirmadas. </w:t>
-      </w:r>
-      <w:r>
-        <w:t>Convertir en FK las relaciones implícitas que los datos confirman, después de depurar los valores sin registro padre, y crear índices en las columnas hijas de las FK que no lo tienen.</w:t>
-      </w:r>
-    </w:p>
-    <w:p>
-      <w:pPr>
-        <w:pStyle w:val="ListNumber"/>
-      </w:pPr>
-      <w:r>
-        <w:rPr>
-          <w:b/>
-        </w:rPr>
-        <w:t xml:space="preserve">Controles de calidad en la entrada. </w:t>
-      </w:r>
-      <w:r>
-        <w:t>Validar formato y obligatoriedad de los datos antes de guardarlos (rechazo o cuarentena de los registros que no cumplan), para que las tablas operativas solo reciban datos válidos.</w:t>
-      </w:r>
-    </w:p>
-    <w:p>
-      <w:pPr>
-        <w:pStyle w:val="ListNumber"/>
-      </w:pPr>
-      <w:r>
-        <w:rPr>
-          <w:b/>
-        </w:rPr>
-        <w:t xml:space="preserve">Depuración preventiva. </w:t>
-      </w:r>
-      <w:r>
-        <w:t>Revisar con el equipo de desarrollo las tablas sin filas y las de apoyo; marcar las que no se usen (por ejemplo con el sufijo _deprecated) durante un periodo de observación y retirarlas después si ninguna aplicación las consulta.</w:t>
-      </w:r>
-    </w:p>
-    <w:p>
-      <w:pPr>
-        <w:pStyle w:val="ListNumber"/>
-      </w:pPr>
-      <w:r>
-        <w:rPr>
-          <w:b/>
-        </w:rPr>
-        <w:t xml:space="preserve">Completar el diccionario. </w:t>
-      </w:r>
-      <w:r>
-        <w:t>Registrar las descripciones de negocio como COMMENT ON TABLE / COMMENT ON COLUMN, de modo que la documentación viaje con la base y el portal se actualice al regenerarlo.</w:t>
-      </w:r>
-    </w:p>
-    <w:p>
-      <w:pPr>
-        <w:pStyle w:val="ListNumber"/>
-      </w:pPr>
-      <w:r>
-        <w:rPr>
-          <w:b/>
-        </w:rPr>
-        <w:t xml:space="preserve">Gobierno de datos personales. </w:t>
-      </w:r>
-      <w:r>
-        <w:t>Validar la clasificación de columnas con datos personales con el responsable del tratamiento y definir controles de acceso y enmascaramiento para los entornos que no son de producción.</w:t>
-      </w:r>
-    </w:p>
+    <w:tbl>
+      <w:tblPr>
+        <w:tblStyle w:val="TableGrid"/>
+        <w:tblW w:type="auto" w:w="0"/>
+        <w:jc w:val="center"/>
+        <w:tblLayout w:type="fixed"/>
+        <w:tblLook w:firstColumn="1" w:firstRow="1" w:lastColumn="0" w:lastRow="0" w:noHBand="0" w:noVBand="1" w:val="04A0"/>
+      </w:tblPr>
+      <w:tblGrid>
+        <w:gridCol w:w="4816"/>
+        <w:gridCol w:w="4816"/>
+      </w:tblGrid>
+      <w:tr>
+        <w:tc>
+          <w:tcPr>
+            <w:tcW w:type="dxa" w:w="4535"/>
+            <w:shd w:val="clear" w:color="auto" w:fill="0B3D91"/>
+          </w:tcPr>
+          <w:p>
+            <w:r/>
+            <w:r>
+              <w:rPr>
+                <w:b/>
+                <w:color w:val="FFFFFF"/>
+                <w:sz w:val="18"/>
+              </w:rPr>
+              <w:t>Categoría</w:t>
+            </w:r>
+          </w:p>
+        </w:tc>
+        <w:tc>
+          <w:tcPr>
+            <w:tcW w:type="dxa" w:w="1701"/>
+            <w:shd w:val="clear" w:color="auto" w:fill="0B3D91"/>
+          </w:tcPr>
+          <w:p>
+            <w:r/>
+            <w:r>
+              <w:rPr>
+                <w:b/>
+                <w:color w:val="FFFFFF"/>
+                <w:sz w:val="18"/>
+              </w:rPr>
+              <w:t>Columnas</w:t>
+            </w:r>
+          </w:p>
+        </w:tc>
+      </w:tr>
+      <w:tr>
+        <w:tc>
+          <w:tcPr>
+            <w:tcW w:type="dxa" w:w="4535"/>
+          </w:tcPr>
+          <w:p>
+            <w:r/>
+            <w:r>
+              <w:rPr>
+                <w:sz w:val="18"/>
+              </w:rPr>
+              <w:t>Contacto</w:t>
+            </w:r>
+          </w:p>
+        </w:tc>
+        <w:tc>
+          <w:tcPr>
+            <w:tcW w:type="dxa" w:w="1701"/>
+          </w:tcPr>
+          <w:p>
+            <w:pPr>
+              <w:jc w:val="right"/>
+            </w:pPr>
+            <w:r/>
+            <w:r>
+              <w:rPr>
+                <w:sz w:val="18"/>
+              </w:rPr>
+              <w:t>10</w:t>
+            </w:r>
+          </w:p>
+        </w:tc>
+      </w:tr>
+      <w:tr>
+        <w:tc>
+          <w:tcPr>
+            <w:tcW w:type="dxa" w:w="4535"/>
+          </w:tcPr>
+          <w:p>
+            <w:r/>
+            <w:r>
+              <w:rPr>
+                <w:sz w:val="18"/>
+              </w:rPr>
+              <w:t>Nombre de persona</w:t>
+            </w:r>
+          </w:p>
+        </w:tc>
+        <w:tc>
+          <w:tcPr>
+            <w:tcW w:type="dxa" w:w="1701"/>
+          </w:tcPr>
+          <w:p>
+            <w:pPr>
+              <w:jc w:val="right"/>
+            </w:pPr>
+            <w:r/>
+            <w:r>
+              <w:rPr>
+                <w:sz w:val="18"/>
+              </w:rPr>
+              <w:t>6</w:t>
+            </w:r>
+          </w:p>
+        </w:tc>
+      </w:tr>
+      <w:tr>
+        <w:tc>
+          <w:tcPr>
+            <w:tcW w:type="dxa" w:w="4535"/>
+          </w:tcPr>
+          <w:p>
+            <w:r/>
+            <w:r>
+              <w:rPr>
+                <w:sz w:val="18"/>
+              </w:rPr>
+              <w:t>Identificación</w:t>
+            </w:r>
+          </w:p>
+        </w:tc>
+        <w:tc>
+          <w:tcPr>
+            <w:tcW w:type="dxa" w:w="1701"/>
+          </w:tcPr>
+          <w:p>
+            <w:pPr>
+              <w:jc w:val="right"/>
+            </w:pPr>
+            <w:r/>
+            <w:r>
+              <w:rPr>
+                <w:sz w:val="18"/>
+              </w:rPr>
+              <w:t>4</w:t>
+            </w:r>
+          </w:p>
+        </w:tc>
+      </w:tr>
+      <w:tr>
+        <w:tc>
+          <w:tcPr>
+            <w:tcW w:type="dxa" w:w="4535"/>
+          </w:tcPr>
+          <w:p>
+            <w:r/>
+            <w:r>
+              <w:rPr>
+                <w:sz w:val="18"/>
+              </w:rPr>
+              <w:t>Dato personal</w:t>
+            </w:r>
+          </w:p>
+        </w:tc>
+        <w:tc>
+          <w:tcPr>
+            <w:tcW w:type="dxa" w:w="1701"/>
+          </w:tcPr>
+          <w:p>
+            <w:pPr>
+              <w:jc w:val="right"/>
+            </w:pPr>
+            <w:r/>
+            <w:r>
+              <w:rPr>
+                <w:sz w:val="18"/>
+              </w:rPr>
+              <w:t>2</w:t>
+            </w:r>
+          </w:p>
+        </w:tc>
+      </w:tr>
+    </w:tbl>
+    <w:p/>
     <w:p>
       <w:pPr>
         <w:pStyle w:val="Heading1"/>
       </w:pPr>
       <w:r>
-        <w:t>7. Dónde consultar el detalle</w:t>
+        <w:t>6. Dónde consultar el detalle</w:t>
       </w:r>
     </w:p>
     <w:p>
@@ -2341,7 +1731,7 @@
                 <w:color w:val="FFFFFF"/>
                 <w:sz w:val="18"/>
               </w:rPr>
-              <w:t>Qué contiene</w:t>
+              <w:t>Contenido</w:t>
             </w:r>
           </w:p>
         </w:tc>
@@ -2374,7 +1764,7 @@
               <w:rPr>
                 <w:sz w:val="18"/>
               </w:rPr>
-              <w:t>Catálogo</w:t>
+              <w:t>Dominios</w:t>
             </w:r>
           </w:p>
         </w:tc>
@@ -2388,7 +1778,7 @@
               <w:rPr>
                 <w:sz w:val="18"/>
               </w:rPr>
-              <w:t>buscador de tablas y columnas; ficha de cada tabla con columnas, claves, relaciones, índices y uso</w:t>
+              <w:t>Esquemas con su descripción y sus cifras</w:t>
             </w:r>
           </w:p>
         </w:tc>
@@ -2426,7 +1816,7 @@
               <w:rPr>
                 <w:sz w:val="18"/>
               </w:rPr>
-              <w:t>Modelo ER</w:t>
+              <w:t>Catálogo</w:t>
             </w:r>
           </w:p>
         </w:tc>
@@ -2440,7 +1830,7 @@
               <w:rPr>
                 <w:sz w:val="18"/>
               </w:rPr>
-              <w:t>diagrama entidad-relación por dominio, con FK y relaciones implícitas</w:t>
+              <w:t>Buscador de tablas y columnas, y ficha de cada tabla con columnas, claves, relaciones, índices y uso</w:t>
             </w:r>
           </w:p>
         </w:tc>
@@ -2492,7 +1882,7 @@
               <w:rPr>
                 <w:sz w:val="18"/>
               </w:rPr>
-              <w:t>multiplicidad UML medida con datos y cobertura de las relaciones implícitas</w:t>
+              <w:t>Llaves foráneas con multiplicidad UML y relaciones lógicas por nombre de columna</w:t>
             </w:r>
           </w:p>
         </w:tc>
@@ -2530,7 +1920,7 @@
               <w:rPr>
                 <w:sz w:val="18"/>
               </w:rPr>
-              <w:t>Calidad</w:t>
+              <w:t>Modelo ER</w:t>
             </w:r>
           </w:p>
         </w:tc>
@@ -2544,7 +1934,7 @@
               <w:rPr>
                 <w:sz w:val="18"/>
               </w:rPr>
-              <w:t>indicadores K01–K10 y listas de tablas sin clave primaria, sin filas y de apoyo</w:t>
+              <w:t>Diagrama entidad-relación por dominio</w:t>
             </w:r>
           </w:p>
         </w:tc>
@@ -2582,7 +1972,7 @@
               <w:rPr>
                 <w:sz w:val="18"/>
               </w:rPr>
-              <w:t>Identidad</w:t>
+              <w:t>Programables</w:t>
             </w:r>
           </w:p>
         </w:tc>
@@ -2596,7 +1986,7 @@
               <w:rPr>
                 <w:sz w:val="18"/>
               </w:rPr>
-              <w:t>réplicas de correo y documento frente a la fuente maestra</w:t>
+              <w:t>Funciones, procedimientos, triggers, vistas y tipos, con las tablas que usan</w:t>
             </w:r>
           </w:p>
         </w:tc>
@@ -2648,7 +2038,7 @@
               <w:rPr>
                 <w:sz w:val="18"/>
               </w:rPr>
-              <w:t>columnas clasificadas según la Ley 1581 de 2012</w:t>
+              <w:t>Columnas clasificadas según la Ley 1581 de 2012</w:t>
             </w:r>
           </w:p>
         </w:tc>
@@ -2696,7 +2086,7 @@
         <w:t>docs/csv/</w:t>
       </w:r>
       <w:r>
-        <w:t xml:space="preserve"> catálogo, columnas, relaciones, identidad, datos personales e indicadores en CSV.</w:t>
+        <w:t xml:space="preserve"> catálogo, columnas, relaciones, programables y datos personales en formato CSV.</w:t>
       </w:r>
     </w:p>
     <w:p>
@@ -2724,7 +2114,7 @@
         <w:t>docs/informe_extraccion_v0.1-prueba.md</w:t>
       </w:r>
       <w:r>
-        <w:t xml:space="preserve"> cifras de la extracción y cambios frente a la anterior.</w:t>
+        <w:t xml:space="preserve"> cifras de la extracción y cambios frente al corte anterior.</w:t>
       </w:r>
     </w:p>
     <w:p>
@@ -2738,7 +2128,7 @@
         <w:t>sql/extraccion/</w:t>
       </w:r>
       <w:r>
-        <w:t xml:space="preserve"> consultas de solo lectura que producen todo lo anterior y permiten regenerarlo.</w:t>
+        <w:t xml:space="preserve"> consultas de solo lectura que producen esta información y permiten regenerarla.</w:t>
       </w:r>
     </w:p>
     <w:p>
@@ -2757,10 +2147,10 @@
         <w:rPr>
           <w:b/>
         </w:rPr>
-        <w:t xml:space="preserve">FK (llave foránea): </w:t>
+        <w:t xml:space="preserve">Llave foránea (FK): </w:t>
       </w:r>
       <w:r>
-        <w:t>restricción que garantiza que un valor exista en la tabla referenciada.</w:t>
+        <w:t>restricción que obliga a que un valor exista en la tabla referenciada.</w:t>
       </w:r>
     </w:p>
     <w:p>
@@ -2771,10 +2161,10 @@
         <w:rPr>
           <w:b/>
         </w:rPr>
-        <w:t xml:space="preserve">Relación implícita: </w:t>
+        <w:t xml:space="preserve">Relación lógica: </w:t>
       </w:r>
       <w:r>
-        <w:t>columna que por su nombre apunta a otra tabla, pero sin FK que lo garantice.</w:t>
+        <w:t>columna que, por su nombre, corresponde a la clave de otra tabla y no tiene FK declarada.</w:t>
       </w:r>
     </w:p>
     <w:p>
@@ -2788,7 +2178,7 @@
         <w:t xml:space="preserve">Multiplicidad UML: </w:t>
       </w:r>
       <w:r>
-        <w:t>cuántos registros de cada lado participan en una relación (0..1, 1, 0..*, 1..*).</w:t>
+        <w:t>número de registros de cada lado que participan en una relación (0..1, 1, 0..*, 1..*).</w:t>
       </w:r>
     </w:p>
     <w:p>
@@ -2802,7 +2192,7 @@
         <w:t xml:space="preserve">Tabla de apoyo: </w:t>
       </w:r>
       <w:r>
-        <w:t>respaldo, copia, migración o temporal identificada por su nombre.</w:t>
+        <w:t>tabla de respaldo, copia, migración o temporal, identificada por su nombre.</w:t>
       </w:r>
     </w:p>
     <w:p>
@@ -2816,7 +2206,7 @@
         <w:t xml:space="preserve">Fuente maestra: </w:t>
       </w:r>
       <w:r>
-        <w:t>tabla de referencia para un dato (por ejemplo, los datos de identidad de una persona).</w:t>
+        <w:t>tabla de referencia de un dato, como los datos de identificación de una persona.</w:t>
       </w:r>
     </w:p>
     <w:p>
@@ -3316,7 +2706,8 @@
       <w:rFonts w:asciiTheme="majorHAnsi" w:eastAsiaTheme="majorEastAsia" w:hAnsiTheme="majorHAnsi" w:cstheme="majorBidi"/>
       <w:b/>
       <w:bCs/>
-      <w:color w:val="4F81BD" w:themeColor="accent1"/>
+      <w:color w:val="0B3D91"/>
+      <w:sz w:val="22"/>
     </w:rPr>
   </w:style>
   <w:style w:type="paragraph" w:styleId="Heading4">

</xml_diff>